<commit_message>
Actualizacion de archivos Segundo Commit
</commit_message>
<xml_diff>
--- a/Actividad_1.docx
+++ b/Actividad_1.docx
@@ -489,9 +489,36 @@
         <w:ind w:right="3842"/>
         <w:rPr>
           <w:rFonts w:ascii="Arial" w:hAnsi="Arial" w:cs="Arial"/>
+          <w:b/>
+          <w:bCs/>
           <w:color w:val="000000" w:themeColor="text1"/>
         </w:rPr>
       </w:pPr>
+      <w:r>
+        <w:rPr>
+          <w:rFonts w:ascii="Arial" w:hAnsi="Arial" w:cs="Arial"/>
+          <w:b/>
+          <w:bCs/>
+          <w:color w:val="000000" w:themeColor="text1"/>
+        </w:rPr>
+        <w:t>LINK DE GITHUB</w:t>
+      </w:r>
+    </w:p>
+    <w:p>
+      <w:pPr>
+        <w:pStyle w:val="Textoindependiente"/>
+        <w:rPr>
+          <w:rFonts w:ascii="Arial" w:hAnsi="Arial" w:cs="Arial"/>
+          <w:color w:val="000000" w:themeColor="text1"/>
+        </w:rPr>
+      </w:pPr>
+      <w:r>
+        <w:rPr>
+          <w:rFonts w:ascii="Arial" w:hAnsi="Arial" w:cs="Arial"/>
+          <w:color w:val="000000" w:themeColor="text1"/>
+        </w:rPr>
+        <w:t>https://github.com/Edgarsu2024/2026-Clases-InteligenciaDeNegocios</w:t>
+      </w:r>
     </w:p>
     <w:p>
       <w:pPr>
@@ -3186,6 +3213,39 @@
         </w:drawing>
       </w:r>
     </w:p>
+    <w:p/>
+    <w:p/>
+    <w:p>
+      <w:pPr>
+        <w:rPr>
+          <w:b/>
+          <w:bCs/>
+          <w:lang w:val="es-ES"/>
+        </w:rPr>
+      </w:pPr>
+      <w:r>
+        <w:rPr>
+          <w:b/>
+          <w:bCs/>
+          <w:lang w:val="es-ES"/>
+        </w:rPr>
+        <w:t>LINK DE GITHUB</w:t>
+      </w:r>
+    </w:p>
+    <w:p>
+      <w:pPr>
+        <w:rPr>
+          <w:lang w:val="es-ES"/>
+        </w:rPr>
+      </w:pPr>
+      <w:r>
+        <w:rPr>
+          <w:lang w:val="es-ES"/>
+        </w:rPr>
+        <w:t>https://github.com/Edgarsu2024/2026-Clases-InteligenciaDeNegocios</w:t>
+      </w:r>
+    </w:p>
+    <w:p/>
     <w:sectPr>
       <w:pgSz w:w="11906" w:h="16838"/>
       <w:pgMar w:top="1417" w:right="1701" w:bottom="1417" w:left="1701" w:header="708" w:footer="708" w:gutter="0"/>

</xml_diff>